<commit_message>
Batch Update & User Stories
</commit_message>
<xml_diff>
--- a/CPFR_VDS_CPH_Docs/TPM/CPFR_User_Stories-MVP-for-LOE_R2.3.docx
+++ b/CPFR_VDS_CPH_Docs/TPM/CPFR_User_Stories-MVP-for-LOE_R2.3.docx
@@ -391,15 +391,7 @@
     </w:p>
     <w:p>
       <w:r>
-        <w:t xml:space="preserve">This document defines the MVP scope for the CPFR module in CPH, expressed as user stories with acceptance criteria for a CPH engineering LOE spike. It is derived from the full-scope CPFR Problem Definition &amp; User Stories and the BRD. Relevant BRD requirements are brought </w:t>
-      </w:r>
-      <w:proofErr w:type="spellStart"/>
-      <w:r>
-        <w:t>inline</w:t>
-      </w:r>
-      <w:proofErr w:type="spellEnd"/>
-      <w:r>
-        <w:t xml:space="preserve"> with each user story to eliminate the need to cross-reference a separate document during the spike.</w:t>
+        <w:t>This document defines the MVP scope for the CPFR module in CPH, expressed as user stories with acceptance criteria for a CPH engineering LOE spike. It is derived from the full-scope CPFR Problem Definition &amp; User Stories and the BRD. Relevant BRD requirements are brought inline with each user story to eliminate the need to cross-reference a separate document during the spike.</w:t>
       </w:r>
     </w:p>
     <w:p>
@@ -475,15 +467,7 @@
         <w:t>CPFR data viewer:</w:t>
       </w:r>
       <w:r>
-        <w:t xml:space="preserve"> a single embedded Tableau table view per vendor, accessible via CPH (</w:t>
-      </w:r>
-      <w:proofErr w:type="spellStart"/>
-      <w:r>
-        <w:t>iframe</w:t>
-      </w:r>
-      <w:proofErr w:type="spellEnd"/>
-      <w:r>
-        <w:t>). Interactive controls are Tableau-native (SC-BIE). Scorecard view and multi-report selector are not in MVP. (See Figure 2.)</w:t>
+        <w:t xml:space="preserve"> a single embedded Tableau table view per vendor, accessible via CPH (iframe). Interactive controls are Tableau-native (SC-BIE). Scorecard view and multi-report selector are not in MVP. (See Figure 2.)</w:t>
       </w:r>
     </w:p>
     <w:p>
@@ -510,7 +494,6 @@
           <w:b/>
           <w:bCs/>
         </w:rPr>
-        <w:lastRenderedPageBreak/>
         <w:t>Chewy TM / ISM CPFR administration in CPH (MVP):</w:t>
       </w:r>
       <w:r>
@@ -578,15 +561,7 @@
         <w:pStyle w:val="ListBullet"/>
       </w:pPr>
       <w:r>
-        <w:t xml:space="preserve">On-demand mid-week access resolves a specific vendor pain point the current system cannot </w:t>
-      </w:r>
-      <w:proofErr w:type="gramStart"/>
-      <w:r>
-        <w:t>address:</w:t>
-      </w:r>
-      <w:proofErr w:type="gramEnd"/>
-      <w:r>
-        <w:t xml:space="preserve"> when a vendor makes a supply chain change and needs to verify its impact before the following Monday's report, today their only option is to contact their ISM directly. For complex or multi-step changes, this creates date-time versioning confusion as files pass back and forth. Portal access provides a time-stamped immutable daily snapshot as the definitive reference for any discussion.</w:t>
+        <w:t>On-demand mid-week access resolves a specific vendor pain point the current system cannot address: when a vendor makes a supply chain change and needs to verify its impact before the following Monday's report, today their only option is to contact their ISM directly. For complex or multi-step changes, this creates date-time versioning confusion as files pass back and forth. Portal access provides a time-stamped immutable daily snapshot as the definitive reference for any discussion.</w:t>
       </w:r>
     </w:p>
     <w:p>
@@ -677,15 +652,7 @@
         <w:t>Contact management hygiene:</w:t>
       </w:r>
       <w:r>
-        <w:t xml:space="preserve"> reduction in data disclosure incidents (vendor data sent to wrong recipients under the current TM-managed model) and in contact-update support tickets attributable to CPFR distribution. </w:t>
-      </w:r>
-      <w:proofErr w:type="gramStart"/>
-      <w:r>
-        <w:t>Both trackable</w:t>
-      </w:r>
-      <w:proofErr w:type="gramEnd"/>
-      <w:r>
-        <w:t xml:space="preserve"> against current support ticket logs.</w:t>
+        <w:t xml:space="preserve"> reduction in data disclosure incidents (vendor data sent to wrong recipients under the current TM-managed model) and in contact-update support tickets attributable to CPFR distribution. Both trackable against current support ticket logs.</w:t>
       </w:r>
     </w:p>
     <w:p>
@@ -739,15 +706,7 @@
         <w:t>CPH Portal &amp; Platform: Business Requirements — CPFR &amp; Vendor Compliance</w:t>
       </w:r>
       <w:r>
-        <w:t xml:space="preserve">, 2026-02-03) is the canonical full requirements reference, available in the project repository. Key requirements are brought </w:t>
-      </w:r>
-      <w:proofErr w:type="spellStart"/>
-      <w:r>
-        <w:t>inline</w:t>
-      </w:r>
-      <w:proofErr w:type="spellEnd"/>
-      <w:r>
-        <w:t xml:space="preserve"> with each user story below.</w:t>
+        <w:t>, 2026-02-03) is the canonical full requirements reference, available in the project repository. Key requirements are brought inline with each user story below.</w:t>
       </w:r>
     </w:p>
     <w:p>
@@ -755,7 +714,6 @@
         <w:pStyle w:val="ListBullet"/>
       </w:pPr>
       <w:r>
-        <w:lastRenderedPageBreak/>
         <w:t>Open technical questions for the LOE spike are tracked in a separate companion file (see §3 Reference Documents) with section references back to this document — they are not embedded here.</w:t>
       </w:r>
     </w:p>
@@ -789,15 +747,7 @@
         <w:pStyle w:val="ListBullet"/>
       </w:pPr>
       <w:r>
-        <w:t xml:space="preserve">Vendor path: CPH navigation → CPFR → Admin or Reports fork → Reports → CPFR Data Viewer (Tableau </w:t>
-      </w:r>
-      <w:proofErr w:type="spellStart"/>
-      <w:r>
-        <w:t>iframe</w:t>
-      </w:r>
-      <w:proofErr w:type="spellEnd"/>
-      <w:r>
-        <w:t>). Admin → Vendor Admin (role-based), single-vendor scope.</w:t>
+        <w:t>Vendor path: CPH navigation → CPFR → Admin or Reports fork → Reports → CPFR Data Viewer (Tableau iframe). Admin → Vendor Admin (role-based), single-vendor scope.</w:t>
       </w:r>
     </w:p>
     <w:p>
@@ -821,7 +771,13 @@
           <wp:inline distT="0" distB="0" distL="0" distR="0" wp14:anchorId="347BE007" wp14:editId="75940601">
             <wp:extent cx="5996477" cy="6035040"/>
             <wp:effectExtent l="0" t="0" r="0" b="0"/>
-            <wp:docPr id="1" name="Picture 1"/>
+            <wp:docPr id="1" name="Picture 1">
+              <a:extLst xmlns:a="http://schemas.openxmlformats.org/drawingml/2006/main">
+                <a:ext uri="{FF2B5EF4-FFF2-40B4-BE49-F238E27FC236}">
+                  <a16:creationId xmlns:a16="http://schemas.microsoft.com/office/drawing/2014/main" id="{4B225120-BDB7-4905-A285-D3FD25055F0B}"/>
+                </a:ext>
+              </a:extLst>
+            </wp:docPr>
             <wp:cNvGraphicFramePr>
               <a:graphicFrameLocks xmlns:a="http://schemas.openxmlformats.org/drawingml/2006/main" noChangeAspect="1"/>
             </wp:cNvGraphicFramePr>
@@ -835,7 +791,7 @@
                     </pic:cNvPicPr>
                   </pic:nvPicPr>
                   <pic:blipFill>
-                    <a:blip r:embed="rId8">
+                    <a:blip r:embed="rId7">
                       <a:extLst>
                         <a:ext uri="{28A0092B-C50C-407E-A947-70E740481C1C}">
                           <a14:useLocalDpi xmlns:a14="http://schemas.microsoft.com/office/drawing/2010/main" val="0"/>
@@ -882,21 +838,12 @@
         <w:pStyle w:val="Heading3"/>
       </w:pPr>
       <w:r>
-        <w:lastRenderedPageBreak/>
         <w:t>Figure 2: CPH Viewport Wireframe (MVP CPFR Data Viewer)</w:t>
       </w:r>
     </w:p>
     <w:p>
       <w:r>
-        <w:t xml:space="preserve">The MVP CPFR viewer is a dedicated CPH page that </w:t>
-      </w:r>
-      <w:proofErr w:type="spellStart"/>
-      <w:r>
-        <w:t>iframes</w:t>
-      </w:r>
-      <w:proofErr w:type="spellEnd"/>
-      <w:r>
-        <w:t xml:space="preserve"> a Tableau dashboard published by SC-BIE. CPH renders the page shell and vendor metadata display (Vendor Number | Vendor Name | Tier Level). All interactive controls — date selector (daily calendar picker matching SSOT date grain), search field, column-level sort and filter, and Download (.xlsx export preserving Inventory and Forecast as separate tabs for Tier 2 vendors) — are native Tableau dashboard elements configured by SC-BIE. Tab visibility (</w:t>
+        <w:t>The MVP CPFR viewer is a dedicated CPH page that iframes a Tableau dashboard published by SC-BIE. CPH renders the page shell and vendor metadata display (Vendor Number | Vendor Name | Tier Level). All interactive controls — date selector (daily calendar picker matching SSOT date grain), search field, column-level sort and filter, and Download (.xlsx export preserving Inventory and Forecast as separate tabs for Tier 2 vendors) — are native Tableau dashboard elements configured by SC-BIE. Tab visibility (</w:t>
       </w:r>
       <w:r>
         <w:t>Forecast</w:t>
@@ -930,7 +877,13 @@
           <wp:inline distT="0" distB="0" distL="0" distR="0" wp14:anchorId="347BE009" wp14:editId="0AE4ECCA">
             <wp:extent cx="6667500" cy="4643437"/>
             <wp:effectExtent l="0" t="0" r="0" b="0"/>
-            <wp:docPr id="1831286618" name="Picture 1831286618"/>
+            <wp:docPr id="1831286618" name="Picture 1831286618">
+              <a:extLst xmlns:a="http://schemas.openxmlformats.org/drawingml/2006/main">
+                <a:ext uri="{FF2B5EF4-FFF2-40B4-BE49-F238E27FC236}">
+                  <a16:creationId xmlns:a16="http://schemas.microsoft.com/office/drawing/2014/main" id="{E6D99033-81D3-48DD-BD9B-D7DE4E869002}"/>
+                </a:ext>
+              </a:extLst>
+            </wp:docPr>
             <wp:cNvGraphicFramePr>
               <a:graphicFrameLocks xmlns:a="http://schemas.openxmlformats.org/drawingml/2006/main" noChangeAspect="1"/>
             </wp:cNvGraphicFramePr>
@@ -944,7 +897,7 @@
                     </pic:cNvPicPr>
                   </pic:nvPicPr>
                   <pic:blipFill>
-                    <a:blip r:embed="rId9">
+                    <a:blip r:embed="rId8">
                       <a:extLst>
                         <a:ext uri="{28A0092B-C50C-407E-A947-70E740481C1C}">
                           <a14:useLocalDpi xmlns:a14="http://schemas.microsoft.com/office/drawing/2010/main" val="0"/>
@@ -1011,15 +964,7 @@
         <w:t>e vendor admin modal (Figure 3)</w:t>
       </w:r>
       <w:r>
-        <w:t xml:space="preserve"> permits a logged-in vendor to add or remove staff from approved access to their VC, Chargeback, or CPFR documents as well as the CPFR </w:t>
-      </w:r>
-      <w:proofErr w:type="spellStart"/>
-      <w:r>
-        <w:t>iframe</w:t>
-      </w:r>
-      <w:proofErr w:type="spellEnd"/>
-      <w:r>
-        <w:t xml:space="preserve"> viewport, on a per-user basis. Vendors will not have access to tier assignments</w:t>
+        <w:t xml:space="preserve"> permits a logged-in vendor to add or remove staff from approved access to their VC, Chargeback, or CPFR documents as well as the CPFR iframe viewport, on a per-user basis. Vendors will not have access to tier assignments</w:t>
       </w:r>
       <w:r>
         <w:t>, and their options will be governed as a subset of the features enabled by Chewy TMs</w:t>
@@ -1046,15 +991,7 @@
         <w:t>e joint VC/CPFR configuration</w:t>
       </w:r>
       <w:r>
-        <w:t xml:space="preserve">s of </w:t>
-      </w:r>
-      <w:proofErr w:type="spellStart"/>
-      <w:r>
-        <w:t>thes</w:t>
-      </w:r>
-      <w:proofErr w:type="spellEnd"/>
-      <w:r>
-        <w:t xml:space="preserve"> modals</w:t>
+        <w:t>s of thes modals</w:t>
       </w:r>
       <w:r>
         <w:t xml:space="preserve"> extends CPH's existing user management pattern and supports non-fragmentation with VC.</w:t>
@@ -1090,12 +1027,17 @@
           <w:sz w:val="18"/>
           <w:szCs w:val="18"/>
         </w:rPr>
-        <w:lastRenderedPageBreak/>
         <w:drawing>
           <wp:inline distT="0" distB="0" distL="0" distR="0" wp14:anchorId="666AFA2B" wp14:editId="6465B7B9">
             <wp:extent cx="6330276" cy="4114800"/>
             <wp:effectExtent l="0" t="0" r="0" b="0"/>
-            <wp:docPr id="1940943274" name="Picture 2"/>
+            <wp:docPr id="1940943274" name="Picture 2">
+              <a:extLst xmlns:a="http://schemas.openxmlformats.org/drawingml/2006/main">
+                <a:ext uri="{FF2B5EF4-FFF2-40B4-BE49-F238E27FC236}">
+                  <a16:creationId xmlns:a16="http://schemas.microsoft.com/office/drawing/2014/main" id="{D91AADC8-4CD4-4A24-B548-86468B3EA0E3}"/>
+                </a:ext>
+              </a:extLst>
+            </wp:docPr>
             <wp:cNvGraphicFramePr>
               <a:graphicFrameLocks xmlns:a="http://schemas.openxmlformats.org/drawingml/2006/main" noChangeAspect="1"/>
             </wp:cNvGraphicFramePr>
@@ -1107,7 +1049,7 @@
                     <pic:cNvPicPr/>
                   </pic:nvPicPr>
                   <pic:blipFill>
-                    <a:blip r:embed="rId10">
+                    <a:blip r:embed="rId9">
                       <a:extLst>
                         <a:ext uri="{28A0092B-C50C-407E-A947-70E740481C1C}">
                           <a14:useLocalDpi xmlns:a14="http://schemas.microsoft.com/office/drawing/2010/main" val="0"/>
@@ -1186,7 +1128,13 @@
           <wp:inline distT="0" distB="0" distL="0" distR="0" wp14:anchorId="1CC3EB82" wp14:editId="26003398">
             <wp:extent cx="6330461" cy="4114799"/>
             <wp:effectExtent l="0" t="0" r="0" b="0"/>
-            <wp:docPr id="1403947652" name="Picture 1"/>
+            <wp:docPr id="1403947652" name="Picture 1">
+              <a:extLst xmlns:a="http://schemas.openxmlformats.org/drawingml/2006/main">
+                <a:ext uri="{FF2B5EF4-FFF2-40B4-BE49-F238E27FC236}">
+                  <a16:creationId xmlns:a16="http://schemas.microsoft.com/office/drawing/2014/main" id="{AAE69B2E-1250-4B3F-8513-CBD8C0A11452}"/>
+                </a:ext>
+              </a:extLst>
+            </wp:docPr>
             <wp:cNvGraphicFramePr>
               <a:graphicFrameLocks xmlns:a="http://schemas.openxmlformats.org/drawingml/2006/main" noChangeAspect="1"/>
             </wp:cNvGraphicFramePr>
@@ -1198,7 +1146,7 @@
                     <pic:cNvPicPr/>
                   </pic:nvPicPr>
                   <pic:blipFill>
-                    <a:blip r:embed="rId11">
+                    <a:blip r:embed="rId10">
                       <a:extLst>
                         <a:ext uri="{28A0092B-C50C-407E-A947-70E740481C1C}">
                           <a14:useLocalDpi xmlns:a14="http://schemas.microsoft.com/office/drawing/2010/main" val="0"/>
@@ -1306,42 +1254,18 @@
     </w:p>
     <w:p>
       <w:r>
-        <w:t xml:space="preserve">MVP delivers: (1) vendor-facing CPFR data viewer — CPH page </w:t>
-      </w:r>
-      <w:proofErr w:type="spellStart"/>
-      <w:r>
-        <w:t>iframing</w:t>
-      </w:r>
-      <w:proofErr w:type="spellEnd"/>
-      <w:r>
-        <w:t xml:space="preserve"> SC-BIE Tableau; interactive controls are Tableau-native; (2) vendor self-service user management via existing Edit User (Figure 3), including CPFR subscription mapping; (3) Chewy TM/ISM CPFR administration in CPH — tier assignment and CPFR contact/distribution with multi-vendor TM workflows and single-vendor vendor workflows (TM-1). Scorecard KPI view is not in MVP.</w:t>
-      </w:r>
-    </w:p>
-    <w:p>
-      <w:r>
-        <w:t xml:space="preserve">Engineering surface </w:t>
-      </w:r>
-      <w:proofErr w:type="gramStart"/>
-      <w:r>
-        <w:t>includes:</w:t>
-      </w:r>
-      <w:proofErr w:type="gramEnd"/>
-      <w:r>
-        <w:t xml:space="preserve"> </w:t>
+        <w:t>MVP delivers: (1) vendor-facing CPFR data viewer — CPH page iframing SC-BIE Tableau; interactive controls are Tableau-native; (2) vendor self-service user management via existing Edit User (Figure 3), including CPFR subscription mapping; (3) Chewy TM/ISM CPFR administration in CPH — tier assignment and CPFR contact/distribution with multi-vendor TM workflows and single-vendor vendor workflows (TM-1). Scorecard KPI view is not in MVP.</w:t>
+      </w:r>
+    </w:p>
+    <w:p>
+      <w:r>
+        <w:t xml:space="preserve">Engineering surface includes: </w:t>
       </w:r>
       <w:r>
         <w:t>Navigation routing</w:t>
       </w:r>
       <w:r>
-        <w:t xml:space="preserve">, </w:t>
-      </w:r>
-      <w:proofErr w:type="spellStart"/>
-      <w:r>
-        <w:t>iframe</w:t>
-      </w:r>
-      <w:proofErr w:type="spellEnd"/>
-      <w:r>
-        <w:t xml:space="preserve"> shell, vendor metadata display, TM admin screens for tier/contacts, subscription/provisioning extension for CPFR, and integration to existing Snowflake tier/contact tables. Email distribution mechanics stay as-is; CPH does not become the email orchestration UI for MVP.</w:t>
+        <w:t>, iframe shell, vendor metadata display, TM admin screens for tier/contacts, subscription/provisioning extension for CPFR, and integration to existing Snowflake tier/contact tables. Email distribution mechanics stay as-is; CPH does not become the email orchestration UI for MVP.</w:t>
       </w:r>
     </w:p>
     <w:p>
@@ -1513,7 +1437,6 @@
         <w:pStyle w:val="Heading3"/>
       </w:pPr>
       <w:r>
-        <w:lastRenderedPageBreak/>
         <w:t>V-1: Access CPFR Data On-Demand via Portal</w:t>
       </w:r>
     </w:p>
@@ -1560,15 +1483,7 @@
         <w:pStyle w:val="ListNumber"/>
       </w:pPr>
       <w:r>
-        <w:t xml:space="preserve">Vendor sees only data for their own vendor entity (vendor isolation enforced at both the CPH layer and within the Tableau workbook). Vendor identity handoff into the </w:t>
-      </w:r>
-      <w:proofErr w:type="spellStart"/>
-      <w:r>
-        <w:t>iframe</w:t>
-      </w:r>
-      <w:proofErr w:type="spellEnd"/>
-      <w:r>
-        <w:t xml:space="preserve"> is a spike topic — see companion Open Questions file.</w:t>
+        <w:t>Vendor sees only data for their own vendor entity (vendor isolation enforced at both the CPH layer and within the Tableau workbook). Vendor identity handoff into the iframe is a spike topic — see companion Open Questions file.</w:t>
       </w:r>
     </w:p>
     <w:p>
@@ -1596,15 +1511,7 @@
         <w:t>Excludes:</w:t>
       </w:r>
       <w:r>
-        <w:t xml:space="preserve"> API access; data export beyond report </w:t>
-      </w:r>
-      <w:proofErr w:type="gramStart"/>
-      <w:r>
-        <w:t>download</w:t>
-      </w:r>
-      <w:proofErr w:type="gramEnd"/>
-      <w:r>
-        <w:t xml:space="preserve"> (see V-5); custom query capabilities; email delivery management</w:t>
+        <w:t xml:space="preserve"> API access; data export beyond report download (see V-5); custom query capabilities; email delivery management</w:t>
       </w:r>
       <w:r>
         <w:t>, vendor scorecard</w:t>
@@ -1729,7 +1636,7 @@
         <w:pStyle w:val="ListNumber"/>
         <w:numPr>
           <w:ilvl w:val="0"/>
-          <w:numId w:val="7"/>
+          <w:numId w:val="3"/>
         </w:numPr>
       </w:pPr>
       <w:r>
@@ -1856,11 +1763,10 @@
         <w:pStyle w:val="ListNumber"/>
         <w:numPr>
           <w:ilvl w:val="0"/>
-          <w:numId w:val="8"/>
+          <w:numId w:val="6"/>
         </w:numPr>
       </w:pPr>
       <w:r>
-        <w:lastRenderedPageBreak/>
         <w:t>Two data templates are available, patterned after the existing CPFR tier structure:</w:t>
       </w:r>
     </w:p>
@@ -1891,15 +1797,7 @@
         <w:t>Tier 2</w:t>
       </w:r>
       <w:r>
-        <w:t xml:space="preserve"> — Inventory + Forecast: inventory metrics (On Order [OO], On Hand [OH], PDP OOS %, </w:t>
-      </w:r>
-      <w:proofErr w:type="spellStart"/>
-      <w:r>
-        <w:t>Autoship</w:t>
-      </w:r>
-      <w:proofErr w:type="spellEnd"/>
-      <w:r>
-        <w:t xml:space="preserve"> Demand [AS Demand], Fill Rate, Days of Supply [DoS]) plus the same 6-month demand forecast as Tier 3. Vendors assigned this tier see both the Inventory and Forecast tabs in the viewer.</w:t>
+        <w:t xml:space="preserve"> — Inventory + Forecast: inventory metrics (On Order [OO], On Hand [OH], PDP OOS %, Autoship Demand [AS Demand], Fill Rate, Days of Supply [DoS]) plus the same 6-month demand forecast as Tier 3. Vendors assigned this tier see both the Inventory and Forecast tabs in the viewer.</w:t>
       </w:r>
     </w:p>
     <w:p>
@@ -2192,7 +2090,6 @@
           <w:sz w:val="18"/>
           <w:szCs w:val="18"/>
         </w:rPr>
-        <w:lastRenderedPageBreak/>
         <w:t xml:space="preserve">REQ-1.3 — CPFR and VC Recipient Lists as Separate Manageable Elements: </w:t>
       </w:r>
       <w:r>
@@ -2295,14 +2192,12 @@
         <w:pStyle w:val="ListNumber"/>
         <w:numPr>
           <w:ilvl w:val="0"/>
-          <w:numId w:val="10"/>
+          <w:numId w:val="7"/>
         </w:numPr>
       </w:pPr>
-      <w:proofErr w:type="gramStart"/>
       <w:r>
         <w:t>Vendor</w:t>
       </w:r>
-      <w:proofErr w:type="gramEnd"/>
       <w:r>
         <w:t xml:space="preserve"> contact</w:t>
       </w:r>
@@ -2413,7 +2308,7 @@
         <w:pStyle w:val="ListNumber"/>
         <w:numPr>
           <w:ilvl w:val="0"/>
-          <w:numId w:val="11"/>
+          <w:numId w:val="8"/>
         </w:numPr>
       </w:pPr>
       <w:r>
@@ -2425,16 +2320,11 @@
         <w:pStyle w:val="ListNumber"/>
       </w:pPr>
       <w:r>
-        <w:t>The selected report is downloadable via the Download button as an .</w:t>
-      </w:r>
-      <w:proofErr w:type="spellStart"/>
-      <w:r>
-        <w:t>xls</w:t>
+        <w:t>The selected report is downloadable via the Download button as an .xls</w:t>
       </w:r>
       <w:r>
         <w:t>b</w:t>
       </w:r>
-      <w:proofErr w:type="spellEnd"/>
       <w:r>
         <w:t xml:space="preserve"> file (see Figure 2).</w:t>
       </w:r>
@@ -2456,16 +2346,11 @@
         <w:t>Excludes:</w:t>
       </w:r>
       <w:r>
-        <w:t xml:space="preserve"> Free-form historical querying. Custom date-range aggregations. Export formats other than .</w:t>
-      </w:r>
-      <w:proofErr w:type="spellStart"/>
-      <w:r>
-        <w:t>xls</w:t>
+        <w:t xml:space="preserve"> Free-form historical querying. Custom date-range aggregations. Export formats other than .xls</w:t>
       </w:r>
       <w:r>
         <w:t>b</w:t>
       </w:r>
-      <w:proofErr w:type="spellEnd"/>
       <w:r>
         <w:t xml:space="preserve"> (SC-BIE's Tableau native export).</w:t>
       </w:r>
@@ -2546,7 +2431,6 @@
           <w:i/>
           <w:iCs/>
         </w:rPr>
-        <w:lastRenderedPageBreak/>
         <w:t>As a Chewy TM or ISM, I want to assign CPFR tier</w:t>
       </w:r>
       <w:r>
@@ -2605,7 +2489,7 @@
         <w:pStyle w:val="ListNumber"/>
         <w:numPr>
           <w:ilvl w:val="0"/>
-          <w:numId w:val="12"/>
+          <w:numId w:val="14"/>
         </w:numPr>
       </w:pPr>
       <w:r>
@@ -2617,7 +2501,7 @@
         <w:pStyle w:val="ListNumber"/>
         <w:numPr>
           <w:ilvl w:val="0"/>
-          <w:numId w:val="12"/>
+          <w:numId w:val="14"/>
         </w:numPr>
       </w:pPr>
       <w:r>
@@ -2629,7 +2513,7 @@
         <w:pStyle w:val="ListNumber"/>
         <w:numPr>
           <w:ilvl w:val="0"/>
-          <w:numId w:val="12"/>
+          <w:numId w:val="14"/>
         </w:numPr>
       </w:pPr>
       <w:r>
@@ -2641,7 +2525,7 @@
         <w:pStyle w:val="ListNumber"/>
         <w:numPr>
           <w:ilvl w:val="0"/>
-          <w:numId w:val="12"/>
+          <w:numId w:val="14"/>
         </w:numPr>
       </w:pPr>
       <w:r>
@@ -2769,7 +2653,6 @@
         <w:pStyle w:val="Heading2"/>
       </w:pPr>
       <w:r>
-        <w:lastRenderedPageBreak/>
         <w:t>3. Reference Documents</w:t>
       </w:r>
     </w:p>
@@ -2996,15 +2879,7 @@
               <w:spacing w:before="0" w:after="0"/>
             </w:pPr>
             <w:r>
-              <w:t>CPFR in CPH Wireflow MVP (.</w:t>
-            </w:r>
-            <w:proofErr w:type="spellStart"/>
-            <w:r>
-              <w:t>png</w:t>
-            </w:r>
-            <w:proofErr w:type="spellEnd"/>
-            <w:r>
-              <w:t>)</w:t>
+              <w:t>CPFR in CPH Wireflow MVP (.png)</w:t>
             </w:r>
           </w:p>
         </w:tc>
@@ -3056,15 +2931,7 @@
               <w:spacing w:before="0" w:after="0"/>
             </w:pPr>
             <w:r>
-              <w:t>CPH Viewport Wireframe (.</w:t>
-            </w:r>
-            <w:proofErr w:type="spellStart"/>
-            <w:r>
-              <w:t>png</w:t>
-            </w:r>
-            <w:proofErr w:type="spellEnd"/>
-            <w:r>
-              <w:t>)</w:t>
+              <w:t>CPH Viewport Wireframe (.png)</w:t>
             </w:r>
           </w:p>
         </w:tc>
@@ -3193,15 +3060,7 @@
               <w:spacing w:before="0" w:after="0"/>
             </w:pPr>
             <w:r>
-              <w:t xml:space="preserve">Financial </w:t>
-            </w:r>
-            <w:proofErr w:type="gramStart"/>
-            <w:r>
-              <w:t>justification;</w:t>
-            </w:r>
-            <w:proofErr w:type="gramEnd"/>
-            <w:r>
-              <w:t xml:space="preserve"> full text reproduced in Appendix B of this document.</w:t>
+              <w:t>Financial justification; full text reproduced in Appendix B of this document.</w:t>
             </w:r>
           </w:p>
         </w:tc>
@@ -3330,7 +3189,6 @@
         <w:pStyle w:val="Heading2"/>
       </w:pPr>
       <w:r>
-        <w:lastRenderedPageBreak/>
         <w:t>Appendix A: Full-Scope Story Map</w:t>
       </w:r>
     </w:p>
@@ -4792,7 +4650,6 @@
         <w:pStyle w:val="Heading2"/>
       </w:pPr>
       <w:r>
-        <w:lastRenderedPageBreak/>
         <w:t>Appendix B: CPFR Portal &amp; Platform Entitlement (Rev4)</w:t>
       </w:r>
     </w:p>
@@ -4845,15 +4702,7 @@
         <w:t>FBLR</w:t>
       </w:r>
       <w:r>
-        <w:t xml:space="preserve"> (fully burdened labor rate) follows GAO-style fully burdened costing. The $64.90/</w:t>
-      </w:r>
-      <w:proofErr w:type="spellStart"/>
-      <w:r>
-        <w:t>hr</w:t>
-      </w:r>
-      <w:proofErr w:type="spellEnd"/>
-      <w:r>
-        <w:t xml:space="preserve"> rate reflects typical professional rates at the C5 level</w:t>
+        <w:t xml:space="preserve"> (fully burdened labor rate) follows GAO-style fully burdened costing. The $64.90/hr rate reflects typical professional rates at the C5 level</w:t>
       </w:r>
       <w:r>
         <w:t xml:space="preserve"> across relevant hub metros.</w:t>
@@ -5003,11 +4852,7 @@
         <w:t>3,2</w:t>
       </w:r>
       <w:r>
-        <w:t xml:space="preserve">00 vendors. While some steps are automated, each cycle still depends on semi-manual initiation, recurring adjustments to contact and report </w:t>
-      </w:r>
-      <w:r>
-        <w:lastRenderedPageBreak/>
-        <w:t>configurations, and frequent re-sends. These repetitive tasks—along with the corrective work that follows minor data discrepancies—inflate otherwise avoidable effort and consume time that could be redirected toward proactive vendor engagement. This cycle also introduces the risk of version drift, when teams or vendors reference slightly different report iterations and data.</w:t>
+        <w:t>00 vendors. While some steps are automated, each cycle still depends on semi-manual initiation, recurring adjustments to contact and report configurations, and frequent re-sends. These repetitive tasks—along with the corrective work that follows minor data discrepancies—inflate otherwise avoidable effort and consume time that could be redirected toward proactive vendor engagement. This cycle also introduces the risk of version drift, when teams or vendors reference slightly different report iterations and data.</w:t>
       </w:r>
     </w:p>
     <w:p>
@@ -5046,15 +4891,7 @@
     </w:p>
     <w:p>
       <w:r>
-        <w:t xml:space="preserve">Within CPH, vendors gain continuous, self-service access to accurate daily data filtered to their specific SKUs. They will also be able to update contact details and communication preferences </w:t>
-      </w:r>
-      <w:proofErr w:type="gramStart"/>
-      <w:r>
-        <w:t>directly—streamlining</w:t>
-      </w:r>
-      <w:proofErr w:type="gramEnd"/>
-      <w:r>
-        <w:t xml:space="preserve"> simple administrative tasks without changing oversight or control by ISMs or leadership. This model supports thousands of concurrent vendor tenants and provides a scalable path toward future API connectivity. The result is stronger collaboration, faster issue resolution, and smoother onboarding of new vendor partners—reducing friction so ISMs can focus on substantive planning conversations rather than routine data delivery.</w:t>
+        <w:t>Within CPH, vendors gain continuous, self-service access to accurate daily data filtered to their specific SKUs. They will also be able to update contact details and communication preferences directly—streamlining simple administrative tasks without changing oversight or control by ISMs or leadership. This model supports thousands of concurrent vendor tenants and provides a scalable path toward future API connectivity. The result is stronger collaboration, faster issue resolution, and smoother onboarding of new vendor partners—reducing friction so ISMs can focus on substantive planning conversations rather than routine data delivery.</w:t>
       </w:r>
     </w:p>
     <w:p>
@@ -5140,7 +4977,6 @@
                 <w:bCs/>
                 <w:color w:val="FFFFFF" w:themeColor="background1"/>
               </w:rPr>
-              <w:lastRenderedPageBreak/>
               <w:t>Benefit Category</w:t>
             </w:r>
           </w:p>
@@ -6191,15 +6027,7 @@
     </w:p>
     <w:p>
       <w:r>
-        <w:t xml:space="preserve">Today, CPFR relies on internally managed vendor contact configurations to distribute sensitive, vendor-specific data at scale. While operationally workable at smaller volumes, this model introduces a growing class of risk as CPFR </w:t>
-      </w:r>
-      <w:proofErr w:type="gramStart"/>
-      <w:r>
-        <w:t>expands:</w:t>
-      </w:r>
-      <w:proofErr w:type="gramEnd"/>
-      <w:r>
-        <w:t xml:space="preserve"> configuration accuracy becomes a prerequisite for data security. As vendor count, batch updates, and distribution complexity increase, the probability and blast radius of misconfiguration increase accordingly.</w:t>
+        <w:t>Today, CPFR relies on internally managed vendor contact configurations to distribute sensitive, vendor-specific data at scale. While operationally workable at smaller volumes, this model introduces a growing class of risk as CPFR expands: configuration accuracy becomes a prerequisite for data security. As vendor count, batch updates, and distribution complexity increase, the probability and blast radius of misconfiguration increase accordingly.</w:t>
       </w:r>
     </w:p>
     <w:p>
@@ -6264,7 +6092,6 @@
               <w:contextualSpacing/>
             </w:pPr>
             <w:r>
-              <w:lastRenderedPageBreak/>
               <w:t>[1] Operational Efficiency Calculations</w:t>
             </w:r>
           </w:p>
@@ -9023,7 +8850,6 @@
         <w:pStyle w:val="Heading4"/>
       </w:pPr>
       <w:r>
-        <w:lastRenderedPageBreak/>
         <w:t>Time Investment in Data Preparation and Validation</w:t>
       </w:r>
     </w:p>
@@ -9162,7 +8988,6 @@
         <w:pStyle w:val="Heading3"/>
       </w:pPr>
       <w:r>
-        <w:lastRenderedPageBreak/>
         <w:t>3. Vendor Self-Service Preferences &amp; API Demand</w:t>
       </w:r>
     </w:p>
@@ -9345,7 +9170,6 @@
         <w:pStyle w:val="ListBullet"/>
       </w:pPr>
       <w:r>
-        <w:lastRenderedPageBreak/>
         <w:t>1-5 hours per ISM per week in CPFR data preparation and COE</w:t>
       </w:r>
     </w:p>
@@ -9589,23 +9413,7 @@
         <w:pStyle w:val="ListBullet"/>
       </w:pPr>
       <w:r>
-        <w:t xml:space="preserve">Pre-launch </w:t>
-      </w:r>
-      <w:proofErr w:type="gramStart"/>
-      <w:r>
-        <w:t>notifications:</w:t>
-      </w:r>
-      <w:proofErr w:type="gramEnd"/>
-      <w:r>
-        <w:t xml:space="preserve"> sent 30 days prior to each rollout milestone, specifying go-live timing and </w:t>
-      </w:r>
-      <w:proofErr w:type="spellStart"/>
-      <w:r>
-        <w:t>hypercare</w:t>
-      </w:r>
-      <w:proofErr w:type="spellEnd"/>
-      <w:r>
-        <w:t xml:space="preserve"> period.</w:t>
+        <w:t>Pre-launch notifications: sent 30 days prior to each rollout milestone, specifying go-live timing and hypercare period.</w:t>
       </w:r>
     </w:p>
     <w:p>
@@ -9613,15 +9421,7 @@
         <w:pStyle w:val="ListBullet"/>
       </w:pPr>
       <w:r>
-        <w:t xml:space="preserve">Orientation sessions: offered for internal users and early vendor adopters during the </w:t>
-      </w:r>
-      <w:proofErr w:type="spellStart"/>
-      <w:r>
-        <w:t>hypercare</w:t>
-      </w:r>
-      <w:proofErr w:type="spellEnd"/>
-      <w:r>
-        <w:t xml:space="preserve"> window (≈ 30 days post-launch). Additional sessions may be added based on adoption needs.</w:t>
+        <w:t>Orientation sessions: offered for internal users and early vendor adopters during the hypercare window (≈ 30 days post-launch). Additional sessions may be added based on adoption needs.</w:t>
       </w:r>
     </w:p>
     <w:p>
@@ -9629,7 +9429,6 @@
         <w:pStyle w:val="ListBullet"/>
       </w:pPr>
       <w:r>
-        <w:lastRenderedPageBreak/>
         <w:t>Awareness updates: periodic “coming soon” highlights during development to prepare teams for upcoming functionality.</w:t>
       </w:r>
     </w:p>
@@ -9654,15 +9453,7 @@
         <w:pStyle w:val="ListBullet"/>
       </w:pPr>
       <w:r>
-        <w:t xml:space="preserve">Externally, </w:t>
-      </w:r>
-      <w:proofErr w:type="spellStart"/>
-      <w:r>
-        <w:t>hypercare</w:t>
-      </w:r>
-      <w:proofErr w:type="spellEnd"/>
-      <w:r>
-        <w:t xml:space="preserve"> maintains Chewy’s commitment to partnership by providing responsive support and encouraging early adoption success.</w:t>
+        <w:t>Externally, hypercare maintains Chewy’s commitment to partnership by providing responsive support and encouraging early adoption success.</w:t>
       </w:r>
     </w:p>
     <w:p>
@@ -9674,8 +9465,8 @@
       </w:r>
     </w:p>
     <w:sectPr>
-      <w:headerReference w:type="default" r:id="rId12"/>
-      <w:footerReference w:type="default" r:id="rId13"/>
+      <w:headerReference w:type="default" r:id="rId11"/>
+      <w:footerReference w:type="default" r:id="rId12"/>
       <w:pgSz w:w="12240" w:h="15840"/>
       <w:pgMar w:top="720" w:right="720" w:bottom="720" w:left="720" w:header="288" w:footer="288" w:gutter="288"/>
       <w:lnNumType w:countBy="1" w:distance="360" w:restart="continuous"/>
@@ -9836,25 +9627,25 @@
   <w:abstractNum w:abstractNumId="0" w15:restartNumberingAfterBreak="0">
     <w:nsid w:val="FFFFFF7F"/>
     <w:multiLevelType w:val="singleLevel"/>
-    <w:tmpl w:val="25800716"/>
+    <w:tmpl w:val="C6625620"/>
     <w:lvl w:ilvl="0">
       <w:start w:val="1"/>
-      <w:numFmt w:val="lowerLetter"/>
+      <w:numFmt w:val="decimal"/>
       <w:pStyle w:val="ListNumber2"/>
-      <w:lvlText w:val="%1)"/>
+      <w:lvlText w:val="%1."/>
       <w:lvlJc w:val="left"/>
       <w:pPr>
+        <w:tabs>
+          <w:tab w:val="num" w:pos="720"/>
+        </w:tabs>
         <w:ind w:left="720" w:hanging="360"/>
       </w:pPr>
-      <w:rPr>
-        <w:rFonts w:hint="default"/>
-      </w:rPr>
     </w:lvl>
   </w:abstractNum>
   <w:abstractNum w:abstractNumId="1" w15:restartNumberingAfterBreak="0">
     <w:nsid w:val="FFFFFF88"/>
     <w:multiLevelType w:val="singleLevel"/>
-    <w:tmpl w:val="CFF8170A"/>
+    <w:tmpl w:val="7CA65A82"/>
     <w:lvl w:ilvl="0">
       <w:start w:val="1"/>
       <w:numFmt w:val="decimal"/>
@@ -9863,19 +9654,16 @@
       <w:lvlJc w:val="left"/>
       <w:pPr>
         <w:tabs>
-          <w:tab w:val="num" w:pos="504"/>
+          <w:tab w:val="num" w:pos="360"/>
         </w:tabs>
-        <w:ind w:left="504" w:hanging="360"/>
-      </w:pPr>
-      <w:rPr>
-        <w:rFonts w:hint="default"/>
-      </w:rPr>
+        <w:ind w:left="360" w:hanging="360"/>
+      </w:pPr>
     </w:lvl>
   </w:abstractNum>
   <w:abstractNum w:abstractNumId="2" w15:restartNumberingAfterBreak="0">
     <w:nsid w:val="FFFFFF89"/>
     <w:multiLevelType w:val="singleLevel"/>
-    <w:tmpl w:val="D46A8DFC"/>
+    <w:tmpl w:val="EB7200BC"/>
     <w:lvl w:ilvl="0">
       <w:start w:val="1"/>
       <w:numFmt w:val="bullet"/>
@@ -10129,20 +9917,17 @@
       <w:lvlJc w:val="left"/>
     </w:lvl>
   </w:abstractNum>
-  <w:num w:numId="1" w16cid:durableId="639962578">
-    <w:abstractNumId w:val="3"/>
-    <w:lvlOverride w:ilvl="0">
-      <w:startOverride w:val="1"/>
-    </w:lvlOverride>
-  </w:num>
-  <w:num w:numId="2" w16cid:durableId="1167668397">
+  <w:num w:numId="1" w16cid:durableId="1167668397">
     <w:abstractNumId w:val="5"/>
     <w:lvlOverride w:ilvl="0">
       <w:startOverride w:val="1"/>
     </w:lvlOverride>
   </w:num>
-  <w:num w:numId="3" w16cid:durableId="1911305117">
-    <w:abstractNumId w:val="4"/>
+  <w:num w:numId="2" w16cid:durableId="1259562445">
+    <w:abstractNumId w:val="1"/>
+  </w:num>
+  <w:num w:numId="3" w16cid:durableId="1441484684">
+    <w:abstractNumId w:val="1"/>
     <w:lvlOverride w:ilvl="0">
       <w:startOverride w:val="1"/>
     </w:lvlOverride>
@@ -10150,19 +9935,25 @@
   <w:num w:numId="4" w16cid:durableId="1859000767">
     <w:abstractNumId w:val="2"/>
   </w:num>
-  <w:num w:numId="5" w16cid:durableId="304550695">
-    <w:abstractNumId w:val="1"/>
+  <w:num w:numId="5" w16cid:durableId="1911305117">
+    <w:abstractNumId w:val="4"/>
+    <w:lvlOverride w:ilvl="0">
+      <w:startOverride w:val="1"/>
+    </w:lvlOverride>
   </w:num>
-  <w:num w:numId="6" w16cid:durableId="438990551">
-    <w:abstractNumId w:val="0"/>
-  </w:num>
-  <w:num w:numId="7" w16cid:durableId="1441484684">
+  <w:num w:numId="6" w16cid:durableId="1916546927">
     <w:abstractNumId w:val="1"/>
     <w:lvlOverride w:ilvl="0">
       <w:startOverride w:val="1"/>
     </w:lvlOverride>
   </w:num>
-  <w:num w:numId="8" w16cid:durableId="1916546927">
+  <w:num w:numId="7" w16cid:durableId="1934626020">
+    <w:abstractNumId w:val="1"/>
+    <w:lvlOverride w:ilvl="0">
+      <w:startOverride w:val="1"/>
+    </w:lvlOverride>
+  </w:num>
+  <w:num w:numId="8" w16cid:durableId="19939441">
     <w:abstractNumId w:val="1"/>
     <w:lvlOverride w:ilvl="0">
       <w:startOverride w:val="1"/>
@@ -10174,19 +9965,22 @@
       <w:startOverride w:val="1"/>
     </w:lvlOverride>
   </w:num>
-  <w:num w:numId="10" w16cid:durableId="1934626020">
+  <w:num w:numId="10" w16cid:durableId="227229382">
+    <w:abstractNumId w:val="0"/>
+  </w:num>
+  <w:num w:numId="11" w16cid:durableId="304550695">
     <w:abstractNumId w:val="1"/>
+  </w:num>
+  <w:num w:numId="12" w16cid:durableId="438990551">
+    <w:abstractNumId w:val="0"/>
+  </w:num>
+  <w:num w:numId="13" w16cid:durableId="639962578">
+    <w:abstractNumId w:val="3"/>
     <w:lvlOverride w:ilvl="0">
       <w:startOverride w:val="1"/>
     </w:lvlOverride>
   </w:num>
-  <w:num w:numId="11" w16cid:durableId="19939441">
-    <w:abstractNumId w:val="1"/>
-    <w:lvlOverride w:ilvl="0">
-      <w:startOverride w:val="1"/>
-    </w:lvlOverride>
-  </w:num>
-  <w:num w:numId="12" w16cid:durableId="660080380">
+  <w:num w:numId="14" w16cid:durableId="660080380">
     <w:abstractNumId w:val="1"/>
     <w:lvlOverride w:ilvl="0">
       <w:startOverride w:val="1"/>
@@ -10844,7 +10638,7 @@
     <w:rsid w:val="008D71C2"/>
     <w:pPr>
       <w:numPr>
-        <w:numId w:val="5"/>
+        <w:numId w:val="11"/>
       </w:numPr>
       <w:spacing w:before="180" w:after="180"/>
       <w:contextualSpacing/>
@@ -10858,7 +10652,7 @@
     <w:rsid w:val="008D71C2"/>
     <w:pPr>
       <w:numPr>
-        <w:numId w:val="6"/>
+        <w:numId w:val="12"/>
       </w:numPr>
       <w:contextualSpacing/>
     </w:pPr>
@@ -11181,18 +10975,6 @@
 </a:theme>
 </file>
 
-<file path=customXml/item1.xml><?xml version="1.0" encoding="utf-8"?>
-<b:Sources xmlns:b="http://schemas.openxmlformats.org/officeDocument/2006/bibliography" xmlns="http://schemas.openxmlformats.org/officeDocument/2006/bibliography" SelectedStyle="/APASixthEditionOfficeOnline.xsl" StyleName="APA" Version="6"/>
-</file>
-
-<file path=customXml/itemProps1.xml><?xml version="1.0" encoding="utf-8"?>
-<ds:datastoreItem xmlns:ds="http://schemas.openxmlformats.org/officeDocument/2006/customXml" ds:itemID="{1D4B1A64-4B58-CB40-9E5D-C6E317C44DF5}">
-  <ds:schemaRefs>
-    <ds:schemaRef ds:uri="http://schemas.openxmlformats.org/officeDocument/2006/bibliography"/>
-  </ds:schemaRefs>
-</ds:datastoreItem>
-</file>
-
 <file path=docMetadata/LabelInfo.xml><?xml version="1.0" encoding="utf-8"?>
 <clbl:labelList xmlns:clbl="http://schemas.microsoft.com/office/2020/mipLabelMetadata">
   <clbl:label id="{99879b8e-3b16-427d-902a-05eda342f629}" enabled="0" method="" siteId="{99879b8e-3b16-427d-902a-05eda342f629}" removed="1"/>

</xml_diff>